<commit_message>
Week 2: Added Auth, Database, and updated Documentation
</commit_message>
<xml_diff>
--- a/REAL Time Chat App Screenshots.docx
+++ b/REAL Time Chat App Screenshots.docx
@@ -2,6 +2,11 @@
 <file path=word/document.xml><?xml version="1.0" encoding="utf-8"?>
 <w:document xmlns:wpc="http://schemas.microsoft.com/office/word/2010/wordprocessingCanvas" xmlns:mc="http://schemas.openxmlformats.org/markup-compatibility/2006" xmlns:o="urn:schemas-microsoft-com:office:office" xmlns:r="http://schemas.openxmlformats.org/officeDocument/2006/relationships" xmlns:m="http://schemas.openxmlformats.org/officeDocument/2006/math" xmlns:v="urn:schemas-microsoft-com:vml" xmlns:wp14="http://schemas.microsoft.com/office/word/2010/wordprocessingDrawing" xmlns:wp="http://schemas.openxmlformats.org/drawingml/2006/wordprocessingDrawing" xmlns:w10="urn:schemas-microsoft-com:office:word" xmlns:w="http://schemas.openxmlformats.org/wordprocessingml/2006/main" xmlns:w14="http://schemas.microsoft.com/office/word/2010/wordml" xmlns:wpg="http://schemas.microsoft.com/office/word/2010/wordprocessingGroup" xmlns:wpi="http://schemas.microsoft.com/office/word/2010/wordprocessingInk" xmlns:wne="http://schemas.microsoft.com/office/word/2006/wordml" xmlns:wps="http://schemas.microsoft.com/office/word/2010/wordprocessingShape" mc:Ignorable="w14 wp14">
   <w:body>
+    <w:p>
+      <w:r>
+        <w:t xml:space="preserve">WEEK 1 </w:t>
+      </w:r>
+    </w:p>
     <w:p>
       <w:r>
         <w:rPr>
@@ -9,99 +14,10 @@
           <w:lang w:bidi="hi-IN"/>
         </w:rPr>
         <w:drawing>
-          <wp:inline distT="0" distB="0" distL="0" distR="0" wp14:anchorId="3ADCDE9E" wp14:editId="4BC3D9B2">
-            <wp:extent cx="5943600" cy="3341370"/>
-            <wp:effectExtent l="0" t="0" r="0" b="0"/>
+          <wp:inline distT="0" distB="0" distL="0" distR="0" wp14:anchorId="3EC897C9" wp14:editId="3073CD44">
+            <wp:extent cx="5943600" cy="3272882"/>
+            <wp:effectExtent l="0" t="0" r="0" b="3810"/>
             <wp:docPr id="1" name="Picture 1"/>
-            <wp:cNvGraphicFramePr>
-              <a:graphicFrameLocks xmlns:a="http://schemas.openxmlformats.org/drawingml/2006/main" noChangeAspect="1"/>
-            </wp:cNvGraphicFramePr>
-            <a:graphic xmlns:a="http://schemas.openxmlformats.org/drawingml/2006/main">
-              <a:graphicData uri="http://schemas.openxmlformats.org/drawingml/2006/picture">
-                <pic:pic xmlns:pic="http://schemas.openxmlformats.org/drawingml/2006/picture">
-                  <pic:nvPicPr>
-                    <pic:cNvPr id="0" name=""/>
-                    <pic:cNvPicPr/>
-                  </pic:nvPicPr>
-                  <pic:blipFill>
-                    <a:blip r:embed="rId5"/>
-                    <a:stretch>
-                      <a:fillRect/>
-                    </a:stretch>
-                  </pic:blipFill>
-                  <pic:spPr>
-                    <a:xfrm>
-                      <a:off x="0" y="0"/>
-                      <a:ext cx="5943600" cy="3341370"/>
-                    </a:xfrm>
-                    <a:prstGeom prst="rect">
-                      <a:avLst/>
-                    </a:prstGeom>
-                  </pic:spPr>
-                </pic:pic>
-              </a:graphicData>
-            </a:graphic>
-          </wp:inline>
-        </w:drawing>
-      </w:r>
-    </w:p>
-    <w:p/>
-    <w:p>
-      <w:r>
-        <w:rPr>
-          <w:noProof/>
-          <w:lang w:bidi="hi-IN"/>
-        </w:rPr>
-        <w:drawing>
-          <wp:inline distT="0" distB="0" distL="0" distR="0" wp14:anchorId="4C46E3B2" wp14:editId="6AD8E3F7">
-            <wp:extent cx="5943600" cy="3341370"/>
-            <wp:effectExtent l="0" t="0" r="0" b="0"/>
-            <wp:docPr id="2" name="Picture 2"/>
-            <wp:cNvGraphicFramePr>
-              <a:graphicFrameLocks xmlns:a="http://schemas.openxmlformats.org/drawingml/2006/main" noChangeAspect="1"/>
-            </wp:cNvGraphicFramePr>
-            <a:graphic xmlns:a="http://schemas.openxmlformats.org/drawingml/2006/main">
-              <a:graphicData uri="http://schemas.openxmlformats.org/drawingml/2006/picture">
-                <pic:pic xmlns:pic="http://schemas.openxmlformats.org/drawingml/2006/picture">
-                  <pic:nvPicPr>
-                    <pic:cNvPr id="0" name=""/>
-                    <pic:cNvPicPr/>
-                  </pic:nvPicPr>
-                  <pic:blipFill>
-                    <a:blip r:embed="rId6"/>
-                    <a:stretch>
-                      <a:fillRect/>
-                    </a:stretch>
-                  </pic:blipFill>
-                  <pic:spPr>
-                    <a:xfrm>
-                      <a:off x="0" y="0"/>
-                      <a:ext cx="5943600" cy="3341370"/>
-                    </a:xfrm>
-                    <a:prstGeom prst="rect">
-                      <a:avLst/>
-                    </a:prstGeom>
-                  </pic:spPr>
-                </pic:pic>
-              </a:graphicData>
-            </a:graphic>
-          </wp:inline>
-        </w:drawing>
-      </w:r>
-    </w:p>
-    <w:p/>
-    <w:p>
-      <w:r>
-        <w:rPr>
-          <w:noProof/>
-          <w:lang w:bidi="hi-IN"/>
-        </w:rPr>
-        <w:lastRenderedPageBreak/>
-        <w:drawing>
-          <wp:inline distT="0" distB="0" distL="0" distR="0" wp14:anchorId="6DED801A" wp14:editId="1640E582">
-            <wp:extent cx="5943600" cy="3341370"/>
-            <wp:effectExtent l="0" t="0" r="0" b="0"/>
-            <wp:docPr id="3" name="Picture 3"/>
             <wp:cNvGraphicFramePr>
               <a:graphicFrameLocks xmlns:a="http://schemas.openxmlformats.org/drawingml/2006/main" noChangeAspect="1"/>
             </wp:cNvGraphicFramePr>
@@ -121,7 +37,7 @@
                   <pic:spPr>
                     <a:xfrm>
                       <a:off x="0" y="0"/>
-                      <a:ext cx="5943600" cy="3341370"/>
+                      <a:ext cx="5943600" cy="3272882"/>
                     </a:xfrm>
                     <a:prstGeom prst="rect">
                       <a:avLst/>
@@ -133,11 +49,8 @@
           </wp:inline>
         </w:drawing>
       </w:r>
-    </w:p>
-    <w:p>
-      <w:r>
-        <w:t>Live_Chat_Proof.png</w:t>
-      </w:r>
+      <w:bookmarkStart w:id="0" w:name="_GoBack"/>
+      <w:bookmarkEnd w:id="0"/>
     </w:p>
     <w:p>
       <w:r>
@@ -146,10 +59,10 @@
           <w:lang w:bidi="hi-IN"/>
         </w:rPr>
         <w:drawing>
-          <wp:inline distT="0" distB="0" distL="0" distR="0" wp14:anchorId="43042FAA" wp14:editId="6F35638D">
+          <wp:inline distT="0" distB="0" distL="0" distR="0" wp14:anchorId="4C46E3B2" wp14:editId="6AD8E3F7">
             <wp:extent cx="5943600" cy="3341370"/>
             <wp:effectExtent l="0" t="0" r="0" b="0"/>
-            <wp:docPr id="4" name="Picture 4"/>
+            <wp:docPr id="2" name="Picture 2"/>
             <wp:cNvGraphicFramePr>
               <a:graphicFrameLocks xmlns:a="http://schemas.openxmlformats.org/drawingml/2006/main" noChangeAspect="1"/>
             </wp:cNvGraphicFramePr>
@@ -182,6 +95,7 @@
         </w:drawing>
       </w:r>
     </w:p>
+    <w:p/>
     <w:p>
       <w:r>
         <w:rPr>
@@ -190,10 +104,10 @@
         </w:rPr>
         <w:lastRenderedPageBreak/>
         <w:drawing>
-          <wp:inline distT="0" distB="0" distL="0" distR="0" wp14:anchorId="6DF1B22E" wp14:editId="745F908C">
+          <wp:inline distT="0" distB="0" distL="0" distR="0" wp14:anchorId="6DED801A" wp14:editId="1640E582">
             <wp:extent cx="5943600" cy="3341370"/>
             <wp:effectExtent l="0" t="0" r="0" b="0"/>
-            <wp:docPr id="5" name="Picture 5"/>
+            <wp:docPr id="3" name="Picture 3"/>
             <wp:cNvGraphicFramePr>
               <a:graphicFrameLocks xmlns:a="http://schemas.openxmlformats.org/drawingml/2006/main" noChangeAspect="1"/>
             </wp:cNvGraphicFramePr>
@@ -228,15 +142,20 @@
     </w:p>
     <w:p>
       <w:r>
+        <w:t>Live_Chat_Proof.png</w:t>
+      </w:r>
+    </w:p>
+    <w:p>
+      <w:r>
         <w:rPr>
           <w:noProof/>
           <w:lang w:bidi="hi-IN"/>
         </w:rPr>
         <w:drawing>
-          <wp:inline distT="0" distB="0" distL="0" distR="0" wp14:anchorId="11DC9651" wp14:editId="713EAD2D">
+          <wp:inline distT="0" distB="0" distL="0" distR="0" wp14:anchorId="43042FAA" wp14:editId="6F35638D">
             <wp:extent cx="5943600" cy="3341370"/>
             <wp:effectExtent l="0" t="0" r="0" b="0"/>
-            <wp:docPr id="6" name="Picture 6"/>
+            <wp:docPr id="4" name="Picture 4"/>
             <wp:cNvGraphicFramePr>
               <a:graphicFrameLocks xmlns:a="http://schemas.openxmlformats.org/drawingml/2006/main" noChangeAspect="1"/>
             </wp:cNvGraphicFramePr>
@@ -268,8 +187,330 @@
           </wp:inline>
         </w:drawing>
       </w:r>
-      <w:bookmarkStart w:id="0" w:name="_GoBack"/>
-      <w:bookmarkEnd w:id="0"/>
+    </w:p>
+    <w:p>
+      <w:r>
+        <w:rPr>
+          <w:noProof/>
+          <w:lang w:bidi="hi-IN"/>
+        </w:rPr>
+        <w:lastRenderedPageBreak/>
+        <w:drawing>
+          <wp:inline distT="0" distB="0" distL="0" distR="0" wp14:anchorId="6DF1B22E" wp14:editId="745F908C">
+            <wp:extent cx="5943600" cy="3341370"/>
+            <wp:effectExtent l="0" t="0" r="0" b="0"/>
+            <wp:docPr id="5" name="Picture 5"/>
+            <wp:cNvGraphicFramePr>
+              <a:graphicFrameLocks xmlns:a="http://schemas.openxmlformats.org/drawingml/2006/main" noChangeAspect="1"/>
+            </wp:cNvGraphicFramePr>
+            <a:graphic xmlns:a="http://schemas.openxmlformats.org/drawingml/2006/main">
+              <a:graphicData uri="http://schemas.openxmlformats.org/drawingml/2006/picture">
+                <pic:pic xmlns:pic="http://schemas.openxmlformats.org/drawingml/2006/picture">
+                  <pic:nvPicPr>
+                    <pic:cNvPr id="0" name=""/>
+                    <pic:cNvPicPr/>
+                  </pic:nvPicPr>
+                  <pic:blipFill>
+                    <a:blip r:embed="rId11"/>
+                    <a:stretch>
+                      <a:fillRect/>
+                    </a:stretch>
+                  </pic:blipFill>
+                  <pic:spPr>
+                    <a:xfrm>
+                      <a:off x="0" y="0"/>
+                      <a:ext cx="5943600" cy="3341370"/>
+                    </a:xfrm>
+                    <a:prstGeom prst="rect">
+                      <a:avLst/>
+                    </a:prstGeom>
+                  </pic:spPr>
+                </pic:pic>
+              </a:graphicData>
+            </a:graphic>
+          </wp:inline>
+        </w:drawing>
+      </w:r>
+    </w:p>
+    <w:p>
+      <w:r>
+        <w:rPr>
+          <w:noProof/>
+          <w:lang w:bidi="hi-IN"/>
+        </w:rPr>
+        <w:drawing>
+          <wp:inline distT="0" distB="0" distL="0" distR="0" wp14:anchorId="11DC9651" wp14:editId="713EAD2D">
+            <wp:extent cx="5943600" cy="3341370"/>
+            <wp:effectExtent l="0" t="0" r="0" b="0"/>
+            <wp:docPr id="6" name="Picture 6"/>
+            <wp:cNvGraphicFramePr>
+              <a:graphicFrameLocks xmlns:a="http://schemas.openxmlformats.org/drawingml/2006/main" noChangeAspect="1"/>
+            </wp:cNvGraphicFramePr>
+            <a:graphic xmlns:a="http://schemas.openxmlformats.org/drawingml/2006/main">
+              <a:graphicData uri="http://schemas.openxmlformats.org/drawingml/2006/picture">
+                <pic:pic xmlns:pic="http://schemas.openxmlformats.org/drawingml/2006/picture">
+                  <pic:nvPicPr>
+                    <pic:cNvPr id="0" name=""/>
+                    <pic:cNvPicPr/>
+                  </pic:nvPicPr>
+                  <pic:blipFill>
+                    <a:blip r:embed="rId12"/>
+                    <a:stretch>
+                      <a:fillRect/>
+                    </a:stretch>
+                  </pic:blipFill>
+                  <pic:spPr>
+                    <a:xfrm>
+                      <a:off x="0" y="0"/>
+                      <a:ext cx="5943600" cy="3341370"/>
+                    </a:xfrm>
+                    <a:prstGeom prst="rect">
+                      <a:avLst/>
+                    </a:prstGeom>
+                  </pic:spPr>
+                </pic:pic>
+              </a:graphicData>
+            </a:graphic>
+          </wp:inline>
+        </w:drawing>
+      </w:r>
+    </w:p>
+    <w:p/>
+    <w:p/>
+    <w:p/>
+    <w:p/>
+    <w:p>
+      <w:r>
+        <w:lastRenderedPageBreak/>
+        <w:t xml:space="preserve">WEEK </w:t>
+      </w:r>
+      <w:proofErr w:type="gramStart"/>
+      <w:r>
+        <w:t>2 :</w:t>
+      </w:r>
+      <w:proofErr w:type="gramEnd"/>
+      <w:r>
+        <w:t xml:space="preserve"> </w:t>
+      </w:r>
+    </w:p>
+    <w:p>
+      <w:r>
+        <w:rPr>
+          <w:noProof/>
+          <w:lang w:bidi="hi-IN"/>
+        </w:rPr>
+        <w:drawing>
+          <wp:inline distT="0" distB="0" distL="0" distR="0" wp14:anchorId="54AA7AAE" wp14:editId="1EE19E24">
+            <wp:extent cx="5943600" cy="3341370"/>
+            <wp:effectExtent l="0" t="0" r="0" b="0"/>
+            <wp:docPr id="7" name="Picture 7"/>
+            <wp:cNvGraphicFramePr>
+              <a:graphicFrameLocks xmlns:a="http://schemas.openxmlformats.org/drawingml/2006/main" noChangeAspect="1"/>
+            </wp:cNvGraphicFramePr>
+            <a:graphic xmlns:a="http://schemas.openxmlformats.org/drawingml/2006/main">
+              <a:graphicData uri="http://schemas.openxmlformats.org/drawingml/2006/picture">
+                <pic:pic xmlns:pic="http://schemas.openxmlformats.org/drawingml/2006/picture">
+                  <pic:nvPicPr>
+                    <pic:cNvPr id="0" name=""/>
+                    <pic:cNvPicPr/>
+                  </pic:nvPicPr>
+                  <pic:blipFill>
+                    <a:blip r:embed="rId13"/>
+                    <a:stretch>
+                      <a:fillRect/>
+                    </a:stretch>
+                  </pic:blipFill>
+                  <pic:spPr>
+                    <a:xfrm>
+                      <a:off x="0" y="0"/>
+                      <a:ext cx="5943600" cy="3341370"/>
+                    </a:xfrm>
+                    <a:prstGeom prst="rect">
+                      <a:avLst/>
+                    </a:prstGeom>
+                  </pic:spPr>
+                </pic:pic>
+              </a:graphicData>
+            </a:graphic>
+          </wp:inline>
+        </w:drawing>
+      </w:r>
+    </w:p>
+    <w:p/>
+    <w:p>
+      <w:r>
+        <w:rPr>
+          <w:noProof/>
+          <w:lang w:bidi="hi-IN"/>
+        </w:rPr>
+        <w:drawing>
+          <wp:inline distT="0" distB="0" distL="0" distR="0" wp14:anchorId="63843F31" wp14:editId="3B77D6F1">
+            <wp:extent cx="5943600" cy="3341370"/>
+            <wp:effectExtent l="0" t="0" r="0" b="0"/>
+            <wp:docPr id="8" name="Picture 8"/>
+            <wp:cNvGraphicFramePr>
+              <a:graphicFrameLocks xmlns:a="http://schemas.openxmlformats.org/drawingml/2006/main" noChangeAspect="1"/>
+            </wp:cNvGraphicFramePr>
+            <a:graphic xmlns:a="http://schemas.openxmlformats.org/drawingml/2006/main">
+              <a:graphicData uri="http://schemas.openxmlformats.org/drawingml/2006/picture">
+                <pic:pic xmlns:pic="http://schemas.openxmlformats.org/drawingml/2006/picture">
+                  <pic:nvPicPr>
+                    <pic:cNvPr id="0" name=""/>
+                    <pic:cNvPicPr/>
+                  </pic:nvPicPr>
+                  <pic:blipFill>
+                    <a:blip r:embed="rId14"/>
+                    <a:stretch>
+                      <a:fillRect/>
+                    </a:stretch>
+                  </pic:blipFill>
+                  <pic:spPr>
+                    <a:xfrm>
+                      <a:off x="0" y="0"/>
+                      <a:ext cx="5943600" cy="3341370"/>
+                    </a:xfrm>
+                    <a:prstGeom prst="rect">
+                      <a:avLst/>
+                    </a:prstGeom>
+                  </pic:spPr>
+                </pic:pic>
+              </a:graphicData>
+            </a:graphic>
+          </wp:inline>
+        </w:drawing>
+      </w:r>
+    </w:p>
+    <w:p>
+      <w:r>
+        <w:rPr>
+          <w:noProof/>
+          <w:lang w:bidi="hi-IN"/>
+        </w:rPr>
+        <w:lastRenderedPageBreak/>
+        <w:drawing>
+          <wp:inline distT="0" distB="0" distL="0" distR="0" wp14:anchorId="0E7B0B50" wp14:editId="085B8E27">
+            <wp:extent cx="5943600" cy="3341370"/>
+            <wp:effectExtent l="0" t="0" r="0" b="0"/>
+            <wp:docPr id="9" name="Picture 9"/>
+            <wp:cNvGraphicFramePr>
+              <a:graphicFrameLocks xmlns:a="http://schemas.openxmlformats.org/drawingml/2006/main" noChangeAspect="1"/>
+            </wp:cNvGraphicFramePr>
+            <a:graphic xmlns:a="http://schemas.openxmlformats.org/drawingml/2006/main">
+              <a:graphicData uri="http://schemas.openxmlformats.org/drawingml/2006/picture">
+                <pic:pic xmlns:pic="http://schemas.openxmlformats.org/drawingml/2006/picture">
+                  <pic:nvPicPr>
+                    <pic:cNvPr id="0" name=""/>
+                    <pic:cNvPicPr/>
+                  </pic:nvPicPr>
+                  <pic:blipFill>
+                    <a:blip r:embed="rId15"/>
+                    <a:stretch>
+                      <a:fillRect/>
+                    </a:stretch>
+                  </pic:blipFill>
+                  <pic:spPr>
+                    <a:xfrm>
+                      <a:off x="0" y="0"/>
+                      <a:ext cx="5943600" cy="3341370"/>
+                    </a:xfrm>
+                    <a:prstGeom prst="rect">
+                      <a:avLst/>
+                    </a:prstGeom>
+                  </pic:spPr>
+                </pic:pic>
+              </a:graphicData>
+            </a:graphic>
+          </wp:inline>
+        </w:drawing>
+      </w:r>
+    </w:p>
+    <w:p>
+      <w:r>
+        <w:rPr>
+          <w:noProof/>
+          <w:lang w:bidi="hi-IN"/>
+        </w:rPr>
+        <w:drawing>
+          <wp:inline distT="0" distB="0" distL="0" distR="0" wp14:anchorId="64FE3864" wp14:editId="5E4F7AF5">
+            <wp:extent cx="5943600" cy="3341370"/>
+            <wp:effectExtent l="0" t="0" r="0" b="0"/>
+            <wp:docPr id="10" name="Picture 10"/>
+            <wp:cNvGraphicFramePr>
+              <a:graphicFrameLocks xmlns:a="http://schemas.openxmlformats.org/drawingml/2006/main" noChangeAspect="1"/>
+            </wp:cNvGraphicFramePr>
+            <a:graphic xmlns:a="http://schemas.openxmlformats.org/drawingml/2006/main">
+              <a:graphicData uri="http://schemas.openxmlformats.org/drawingml/2006/picture">
+                <pic:pic xmlns:pic="http://schemas.openxmlformats.org/drawingml/2006/picture">
+                  <pic:nvPicPr>
+                    <pic:cNvPr id="0" name=""/>
+                    <pic:cNvPicPr/>
+                  </pic:nvPicPr>
+                  <pic:blipFill>
+                    <a:blip r:embed="rId16"/>
+                    <a:stretch>
+                      <a:fillRect/>
+                    </a:stretch>
+                  </pic:blipFill>
+                  <pic:spPr>
+                    <a:xfrm>
+                      <a:off x="0" y="0"/>
+                      <a:ext cx="5943600" cy="3341370"/>
+                    </a:xfrm>
+                    <a:prstGeom prst="rect">
+                      <a:avLst/>
+                    </a:prstGeom>
+                  </pic:spPr>
+                </pic:pic>
+              </a:graphicData>
+            </a:graphic>
+          </wp:inline>
+        </w:drawing>
+      </w:r>
+    </w:p>
+    <w:p/>
+    <w:p>
+      <w:r>
+        <w:rPr>
+          <w:noProof/>
+          <w:lang w:bidi="hi-IN"/>
+        </w:rPr>
+        <w:lastRenderedPageBreak/>
+        <w:drawing>
+          <wp:inline distT="0" distB="0" distL="0" distR="0" wp14:anchorId="36803FB8" wp14:editId="7174D0DE">
+            <wp:extent cx="5943600" cy="3341370"/>
+            <wp:effectExtent l="0" t="0" r="0" b="0"/>
+            <wp:docPr id="11" name="Picture 11"/>
+            <wp:cNvGraphicFramePr>
+              <a:graphicFrameLocks xmlns:a="http://schemas.openxmlformats.org/drawingml/2006/main" noChangeAspect="1"/>
+            </wp:cNvGraphicFramePr>
+            <a:graphic xmlns:a="http://schemas.openxmlformats.org/drawingml/2006/main">
+              <a:graphicData uri="http://schemas.openxmlformats.org/drawingml/2006/picture">
+                <pic:pic xmlns:pic="http://schemas.openxmlformats.org/drawingml/2006/picture">
+                  <pic:nvPicPr>
+                    <pic:cNvPr id="0" name=""/>
+                    <pic:cNvPicPr/>
+                  </pic:nvPicPr>
+                  <pic:blipFill>
+                    <a:blip r:embed="rId17"/>
+                    <a:stretch>
+                      <a:fillRect/>
+                    </a:stretch>
+                  </pic:blipFill>
+                  <pic:spPr>
+                    <a:xfrm>
+                      <a:off x="0" y="0"/>
+                      <a:ext cx="5943600" cy="3341370"/>
+                    </a:xfrm>
+                    <a:prstGeom prst="rect">
+                      <a:avLst/>
+                    </a:prstGeom>
+                  </pic:spPr>
+                </pic:pic>
+              </a:graphicData>
+            </a:graphic>
+          </wp:inline>
+        </w:drawing>
+      </w:r>
     </w:p>
     <w:sectPr>
       <w:pgSz w:w="12240" w:h="15840"/>
@@ -279,6 +520,56 @@
     </w:sectPr>
   </w:body>
 </w:document>
+</file>
+
+<file path=word/endnotes.xml><?xml version="1.0" encoding="utf-8"?>
+<w:endnotes xmlns:wpc="http://schemas.microsoft.com/office/word/2010/wordprocessingCanvas" xmlns:mc="http://schemas.openxmlformats.org/markup-compatibility/2006" xmlns:o="urn:schemas-microsoft-com:office:office" xmlns:r="http://schemas.openxmlformats.org/officeDocument/2006/relationships" xmlns:m="http://schemas.openxmlformats.org/officeDocument/2006/math" xmlns:v="urn:schemas-microsoft-com:vml" xmlns:wp14="http://schemas.microsoft.com/office/word/2010/wordprocessingDrawing" xmlns:wp="http://schemas.openxmlformats.org/drawingml/2006/wordprocessingDrawing" xmlns:w10="urn:schemas-microsoft-com:office:word" xmlns:w="http://schemas.openxmlformats.org/wordprocessingml/2006/main" xmlns:w14="http://schemas.microsoft.com/office/word/2010/wordml" xmlns:wpg="http://schemas.microsoft.com/office/word/2010/wordprocessingGroup" xmlns:wpi="http://schemas.microsoft.com/office/word/2010/wordprocessingInk" xmlns:wne="http://schemas.microsoft.com/office/word/2006/wordml" xmlns:wps="http://schemas.microsoft.com/office/word/2010/wordprocessingShape" mc:Ignorable="w14 wp14">
+  <w:endnote w:type="separator" w:id="-1">
+    <w:p>
+      <w:pPr>
+        <w:spacing w:after="0" w:line="240" w:lineRule="auto"/>
+      </w:pPr>
+      <w:r>
+        <w:separator/>
+      </w:r>
+    </w:p>
+  </w:endnote>
+  <w:endnote w:type="continuationSeparator" w:id="0">
+    <w:p>
+      <w:pPr>
+        <w:spacing w:after="0" w:line="240" w:lineRule="auto"/>
+      </w:pPr>
+      <w:r>
+        <w:continuationSeparator/>
+      </w:r>
+    </w:p>
+  </w:endnote>
+</w:endnotes>
+</file>
+
+<file path=word/footnotes.xml><?xml version="1.0" encoding="utf-8"?>
+<w:footnotes xmlns:wpc="http://schemas.microsoft.com/office/word/2010/wordprocessingCanvas" xmlns:mc="http://schemas.openxmlformats.org/markup-compatibility/2006" xmlns:o="urn:schemas-microsoft-com:office:office" xmlns:r="http://schemas.openxmlformats.org/officeDocument/2006/relationships" xmlns:m="http://schemas.openxmlformats.org/officeDocument/2006/math" xmlns:v="urn:schemas-microsoft-com:vml" xmlns:wp14="http://schemas.microsoft.com/office/word/2010/wordprocessingDrawing" xmlns:wp="http://schemas.openxmlformats.org/drawingml/2006/wordprocessingDrawing" xmlns:w10="urn:schemas-microsoft-com:office:word" xmlns:w="http://schemas.openxmlformats.org/wordprocessingml/2006/main" xmlns:w14="http://schemas.microsoft.com/office/word/2010/wordml" xmlns:wpg="http://schemas.microsoft.com/office/word/2010/wordprocessingGroup" xmlns:wpi="http://schemas.microsoft.com/office/word/2010/wordprocessingInk" xmlns:wne="http://schemas.microsoft.com/office/word/2006/wordml" xmlns:wps="http://schemas.microsoft.com/office/word/2010/wordprocessingShape" mc:Ignorable="w14 wp14">
+  <w:footnote w:type="separator" w:id="-1">
+    <w:p>
+      <w:pPr>
+        <w:spacing w:after="0" w:line="240" w:lineRule="auto"/>
+      </w:pPr>
+      <w:r>
+        <w:separator/>
+      </w:r>
+    </w:p>
+  </w:footnote>
+  <w:footnote w:type="continuationSeparator" w:id="0">
+    <w:p>
+      <w:pPr>
+        <w:spacing w:after="0" w:line="240" w:lineRule="auto"/>
+      </w:pPr>
+      <w:r>
+        <w:continuationSeparator/>
+      </w:r>
+    </w:p>
+  </w:footnote>
+</w:footnotes>
 </file>
 
 <file path=word/styles.xml><?xml version="1.0" encoding="utf-8"?>
@@ -498,6 +789,56 @@
       <w:rFonts w:ascii="Tahoma" w:hAnsi="Tahoma" w:cs="Tahoma"/>
       <w:sz w:val="16"/>
       <w:szCs w:val="14"/>
+    </w:rPr>
+  </w:style>
+  <w:style w:type="paragraph" w:styleId="Header">
+    <w:name w:val="header"/>
+    <w:basedOn w:val="Normal"/>
+    <w:link w:val="HeaderChar"/>
+    <w:uiPriority w:val="99"/>
+    <w:unhideWhenUsed/>
+    <w:rsid w:val="00837B99"/>
+    <w:pPr>
+      <w:tabs>
+        <w:tab w:val="center" w:pos="4680"/>
+        <w:tab w:val="right" w:pos="9360"/>
+      </w:tabs>
+      <w:spacing w:after="0" w:line="240" w:lineRule="auto"/>
+    </w:pPr>
+  </w:style>
+  <w:style w:type="character" w:customStyle="1" w:styleId="HeaderChar">
+    <w:name w:val="Header Char"/>
+    <w:basedOn w:val="DefaultParagraphFont"/>
+    <w:link w:val="Header"/>
+    <w:uiPriority w:val="99"/>
+    <w:rsid w:val="00837B99"/>
+    <w:rPr>
+      <w:rFonts w:cs="Mangal"/>
+    </w:rPr>
+  </w:style>
+  <w:style w:type="paragraph" w:styleId="Footer">
+    <w:name w:val="footer"/>
+    <w:basedOn w:val="Normal"/>
+    <w:link w:val="FooterChar"/>
+    <w:uiPriority w:val="99"/>
+    <w:unhideWhenUsed/>
+    <w:rsid w:val="00837B99"/>
+    <w:pPr>
+      <w:tabs>
+        <w:tab w:val="center" w:pos="4680"/>
+        <w:tab w:val="right" w:pos="9360"/>
+      </w:tabs>
+      <w:spacing w:after="0" w:line="240" w:lineRule="auto"/>
+    </w:pPr>
+  </w:style>
+  <w:style w:type="character" w:customStyle="1" w:styleId="FooterChar">
+    <w:name w:val="Footer Char"/>
+    <w:basedOn w:val="DefaultParagraphFont"/>
+    <w:link w:val="Footer"/>
+    <w:uiPriority w:val="99"/>
+    <w:rsid w:val="00837B99"/>
+    <w:rPr>
+      <w:rFonts w:cs="Mangal"/>
     </w:rPr>
   </w:style>
 </w:styles>
@@ -720,6 +1061,56 @@
       <w:rFonts w:ascii="Tahoma" w:hAnsi="Tahoma" w:cs="Tahoma"/>
       <w:sz w:val="16"/>
       <w:szCs w:val="14"/>
+    </w:rPr>
+  </w:style>
+  <w:style w:type="paragraph" w:styleId="Header">
+    <w:name w:val="header"/>
+    <w:basedOn w:val="Normal"/>
+    <w:link w:val="HeaderChar"/>
+    <w:uiPriority w:val="99"/>
+    <w:unhideWhenUsed/>
+    <w:rsid w:val="00837B99"/>
+    <w:pPr>
+      <w:tabs>
+        <w:tab w:val="center" w:pos="4680"/>
+        <w:tab w:val="right" w:pos="9360"/>
+      </w:tabs>
+      <w:spacing w:after="0" w:line="240" w:lineRule="auto"/>
+    </w:pPr>
+  </w:style>
+  <w:style w:type="character" w:customStyle="1" w:styleId="HeaderChar">
+    <w:name w:val="Header Char"/>
+    <w:basedOn w:val="DefaultParagraphFont"/>
+    <w:link w:val="Header"/>
+    <w:uiPriority w:val="99"/>
+    <w:rsid w:val="00837B99"/>
+    <w:rPr>
+      <w:rFonts w:cs="Mangal"/>
+    </w:rPr>
+  </w:style>
+  <w:style w:type="paragraph" w:styleId="Footer">
+    <w:name w:val="footer"/>
+    <w:basedOn w:val="Normal"/>
+    <w:link w:val="FooterChar"/>
+    <w:uiPriority w:val="99"/>
+    <w:unhideWhenUsed/>
+    <w:rsid w:val="00837B99"/>
+    <w:pPr>
+      <w:tabs>
+        <w:tab w:val="center" w:pos="4680"/>
+        <w:tab w:val="right" w:pos="9360"/>
+      </w:tabs>
+      <w:spacing w:after="0" w:line="240" w:lineRule="auto"/>
+    </w:pPr>
+  </w:style>
+  <w:style w:type="character" w:customStyle="1" w:styleId="FooterChar">
+    <w:name w:val="Footer Char"/>
+    <w:basedOn w:val="DefaultParagraphFont"/>
+    <w:link w:val="Footer"/>
+    <w:uiPriority w:val="99"/>
+    <w:rsid w:val="00837B99"/>
+    <w:rPr>
+      <w:rFonts w:cs="Mangal"/>
     </w:rPr>
   </w:style>
 </w:styles>

</xml_diff>

<commit_message>
Completed Week 3: Added Chat Rooms
</commit_message>
<xml_diff>
--- a/REAL Time Chat App Screenshots.docx
+++ b/REAL Time Chat App Screenshots.docx
@@ -49,8 +49,6 @@
           </wp:inline>
         </w:drawing>
       </w:r>
-      <w:bookmarkStart w:id="0" w:name="_GoBack"/>
-      <w:bookmarkEnd w:id="0"/>
     </w:p>
     <w:p>
       <w:r>
@@ -511,6 +509,250 @@
           </wp:inline>
         </w:drawing>
       </w:r>
+    </w:p>
+    <w:p/>
+    <w:p>
+      <w:r>
+        <w:t>WEEK 3</w:t>
+      </w:r>
+    </w:p>
+    <w:p>
+      <w:r>
+        <w:rPr>
+          <w:noProof/>
+          <w:lang w:bidi="hi-IN"/>
+        </w:rPr>
+        <w:drawing>
+          <wp:inline distT="0" distB="0" distL="0" distR="0" wp14:anchorId="15B250E2" wp14:editId="45731C1B">
+            <wp:extent cx="5943600" cy="3341370"/>
+            <wp:effectExtent l="0" t="0" r="0" b="0"/>
+            <wp:docPr id="13" name="Picture 13"/>
+            <wp:cNvGraphicFramePr>
+              <a:graphicFrameLocks xmlns:a="http://schemas.openxmlformats.org/drawingml/2006/main" noChangeAspect="1"/>
+            </wp:cNvGraphicFramePr>
+            <a:graphic xmlns:a="http://schemas.openxmlformats.org/drawingml/2006/main">
+              <a:graphicData uri="http://schemas.openxmlformats.org/drawingml/2006/picture">
+                <pic:pic xmlns:pic="http://schemas.openxmlformats.org/drawingml/2006/picture">
+                  <pic:nvPicPr>
+                    <pic:cNvPr id="0" name=""/>
+                    <pic:cNvPicPr/>
+                  </pic:nvPicPr>
+                  <pic:blipFill>
+                    <a:blip r:embed="rId18"/>
+                    <a:stretch>
+                      <a:fillRect/>
+                    </a:stretch>
+                  </pic:blipFill>
+                  <pic:spPr>
+                    <a:xfrm>
+                      <a:off x="0" y="0"/>
+                      <a:ext cx="5943600" cy="3341370"/>
+                    </a:xfrm>
+                    <a:prstGeom prst="rect">
+                      <a:avLst/>
+                    </a:prstGeom>
+                  </pic:spPr>
+                </pic:pic>
+              </a:graphicData>
+            </a:graphic>
+          </wp:inline>
+        </w:drawing>
+      </w:r>
+    </w:p>
+    <w:p>
+      <w:r>
+        <w:rPr>
+          <w:noProof/>
+          <w:lang w:bidi="hi-IN"/>
+        </w:rPr>
+        <w:lastRenderedPageBreak/>
+        <w:drawing>
+          <wp:inline distT="0" distB="0" distL="0" distR="0" wp14:anchorId="04465160" wp14:editId="2E3A99BB">
+            <wp:extent cx="5943600" cy="3341370"/>
+            <wp:effectExtent l="0" t="0" r="0" b="0"/>
+            <wp:docPr id="14" name="Picture 14"/>
+            <wp:cNvGraphicFramePr>
+              <a:graphicFrameLocks xmlns:a="http://schemas.openxmlformats.org/drawingml/2006/main" noChangeAspect="1"/>
+            </wp:cNvGraphicFramePr>
+            <a:graphic xmlns:a="http://schemas.openxmlformats.org/drawingml/2006/main">
+              <a:graphicData uri="http://schemas.openxmlformats.org/drawingml/2006/picture">
+                <pic:pic xmlns:pic="http://schemas.openxmlformats.org/drawingml/2006/picture">
+                  <pic:nvPicPr>
+                    <pic:cNvPr id="0" name=""/>
+                    <pic:cNvPicPr/>
+                  </pic:nvPicPr>
+                  <pic:blipFill>
+                    <a:blip r:embed="rId19"/>
+                    <a:stretch>
+                      <a:fillRect/>
+                    </a:stretch>
+                  </pic:blipFill>
+                  <pic:spPr>
+                    <a:xfrm>
+                      <a:off x="0" y="0"/>
+                      <a:ext cx="5943600" cy="3341370"/>
+                    </a:xfrm>
+                    <a:prstGeom prst="rect">
+                      <a:avLst/>
+                    </a:prstGeom>
+                  </pic:spPr>
+                </pic:pic>
+              </a:graphicData>
+            </a:graphic>
+          </wp:inline>
+        </w:drawing>
+      </w:r>
+    </w:p>
+    <w:p>
+      <w:r>
+        <w:rPr>
+          <w:noProof/>
+          <w:lang w:bidi="hi-IN"/>
+        </w:rPr>
+        <w:drawing>
+          <wp:inline distT="0" distB="0" distL="0" distR="0" wp14:anchorId="7AA72CE7" wp14:editId="172284F2">
+            <wp:extent cx="5943600" cy="3341370"/>
+            <wp:effectExtent l="0" t="0" r="0" b="0"/>
+            <wp:docPr id="15" name="Picture 15"/>
+            <wp:cNvGraphicFramePr>
+              <a:graphicFrameLocks xmlns:a="http://schemas.openxmlformats.org/drawingml/2006/main" noChangeAspect="1"/>
+            </wp:cNvGraphicFramePr>
+            <a:graphic xmlns:a="http://schemas.openxmlformats.org/drawingml/2006/main">
+              <a:graphicData uri="http://schemas.openxmlformats.org/drawingml/2006/picture">
+                <pic:pic xmlns:pic="http://schemas.openxmlformats.org/drawingml/2006/picture">
+                  <pic:nvPicPr>
+                    <pic:cNvPr id="0" name=""/>
+                    <pic:cNvPicPr/>
+                  </pic:nvPicPr>
+                  <pic:blipFill>
+                    <a:blip r:embed="rId20"/>
+                    <a:stretch>
+                      <a:fillRect/>
+                    </a:stretch>
+                  </pic:blipFill>
+                  <pic:spPr>
+                    <a:xfrm>
+                      <a:off x="0" y="0"/>
+                      <a:ext cx="5943600" cy="3341370"/>
+                    </a:xfrm>
+                    <a:prstGeom prst="rect">
+                      <a:avLst/>
+                    </a:prstGeom>
+                  </pic:spPr>
+                </pic:pic>
+              </a:graphicData>
+            </a:graphic>
+          </wp:inline>
+        </w:drawing>
+      </w:r>
+    </w:p>
+    <w:p/>
+    <w:p/>
+    <w:p/>
+    <w:p/>
+    <w:p>
+      <w:r>
+        <w:rPr>
+          <w:noProof/>
+          <w:lang w:bidi="hi-IN"/>
+        </w:rPr>
+        <w:lastRenderedPageBreak/>
+        <w:drawing>
+          <wp:anchor distT="0" distB="0" distL="114300" distR="114300" simplePos="0" relativeHeight="251658240" behindDoc="0" locked="0" layoutInCell="1" allowOverlap="1">
+            <wp:simplePos x="0" y="0"/>
+            <wp:positionH relativeFrom="column">
+              <wp:align>left</wp:align>
+            </wp:positionH>
+            <wp:positionV relativeFrom="paragraph">
+              <wp:align>top</wp:align>
+            </wp:positionV>
+            <wp:extent cx="5943600" cy="3341370"/>
+            <wp:effectExtent l="0" t="0" r="0" b="0"/>
+            <wp:wrapSquare wrapText="bothSides"/>
+            <wp:docPr id="12" name="Picture 12"/>
+            <wp:cNvGraphicFramePr>
+              <a:graphicFrameLocks xmlns:a="http://schemas.openxmlformats.org/drawingml/2006/main" noChangeAspect="1"/>
+            </wp:cNvGraphicFramePr>
+            <a:graphic xmlns:a="http://schemas.openxmlformats.org/drawingml/2006/main">
+              <a:graphicData uri="http://schemas.openxmlformats.org/drawingml/2006/picture">
+                <pic:pic xmlns:pic="http://schemas.openxmlformats.org/drawingml/2006/picture">
+                  <pic:nvPicPr>
+                    <pic:cNvPr id="0" name=""/>
+                    <pic:cNvPicPr/>
+                  </pic:nvPicPr>
+                  <pic:blipFill>
+                    <a:blip r:embed="rId21">
+                      <a:extLst>
+                        <a:ext uri="{28A0092B-C50C-407E-A947-70E740481C1C}">
+                          <a14:useLocalDpi xmlns:a14="http://schemas.microsoft.com/office/drawing/2010/main" val="0"/>
+                        </a:ext>
+                      </a:extLst>
+                    </a:blip>
+                    <a:stretch>
+                      <a:fillRect/>
+                    </a:stretch>
+                  </pic:blipFill>
+                  <pic:spPr>
+                    <a:xfrm>
+                      <a:off x="0" y="0"/>
+                      <a:ext cx="5943600" cy="3341370"/>
+                    </a:xfrm>
+                    <a:prstGeom prst="rect">
+                      <a:avLst/>
+                    </a:prstGeom>
+                  </pic:spPr>
+                </pic:pic>
+              </a:graphicData>
+            </a:graphic>
+          </wp:anchor>
+        </w:drawing>
+      </w:r>
+      <w:r>
+        <w:br w:type="textWrapping" w:clear="all"/>
+      </w:r>
+      <w:r>
+        <w:rPr>
+          <w:noProof/>
+          <w:lang w:bidi="hi-IN"/>
+        </w:rPr>
+        <w:drawing>
+          <wp:inline distT="0" distB="0" distL="0" distR="0" wp14:anchorId="0E54B37C" wp14:editId="6ECA5C61">
+            <wp:extent cx="5943600" cy="3341370"/>
+            <wp:effectExtent l="0" t="0" r="0" b="0"/>
+            <wp:docPr id="17" name="Picture 17"/>
+            <wp:cNvGraphicFramePr>
+              <a:graphicFrameLocks xmlns:a="http://schemas.openxmlformats.org/drawingml/2006/main" noChangeAspect="1"/>
+            </wp:cNvGraphicFramePr>
+            <a:graphic xmlns:a="http://schemas.openxmlformats.org/drawingml/2006/main">
+              <a:graphicData uri="http://schemas.openxmlformats.org/drawingml/2006/picture">
+                <pic:pic xmlns:pic="http://schemas.openxmlformats.org/drawingml/2006/picture">
+                  <pic:nvPicPr>
+                    <pic:cNvPr id="0" name=""/>
+                    <pic:cNvPicPr/>
+                  </pic:nvPicPr>
+                  <pic:blipFill>
+                    <a:blip r:embed="rId22"/>
+                    <a:stretch>
+                      <a:fillRect/>
+                    </a:stretch>
+                  </pic:blipFill>
+                  <pic:spPr>
+                    <a:xfrm>
+                      <a:off x="0" y="0"/>
+                      <a:ext cx="5943600" cy="3341370"/>
+                    </a:xfrm>
+                    <a:prstGeom prst="rect">
+                      <a:avLst/>
+                    </a:prstGeom>
+                  </pic:spPr>
+                </pic:pic>
+              </a:graphicData>
+            </a:graphic>
+          </wp:inline>
+        </w:drawing>
+      </w:r>
+      <w:bookmarkStart w:id="0" w:name="_GoBack"/>
+      <w:bookmarkEnd w:id="0"/>
     </w:p>
     <w:sectPr>
       <w:pgSz w:w="12240" w:h="15840"/>

</xml_diff>

<commit_message>
Real time chat app screenshots updated
</commit_message>
<xml_diff>
--- a/REAL Time Chat App Screenshots.docx
+++ b/REAL Time Chat App Screenshots.docx
@@ -751,8 +751,278 @@
           </wp:inline>
         </w:drawing>
       </w:r>
+    </w:p>
+    <w:p/>
+    <w:p/>
+    <w:p/>
+    <w:p/>
+    <w:p>
+      <w:r>
+        <w:lastRenderedPageBreak/>
+        <w:t xml:space="preserve">WEEK 4 </w:t>
+      </w:r>
+    </w:p>
+    <w:p>
+      <w:r>
+        <w:rPr>
+          <w:noProof/>
+          <w:lang w:bidi="hi-IN"/>
+        </w:rPr>
+        <w:drawing>
+          <wp:inline distT="0" distB="0" distL="0" distR="0" wp14:anchorId="0A93EF22" wp14:editId="6E7E18BB">
+            <wp:extent cx="5943600" cy="3341370"/>
+            <wp:effectExtent l="0" t="0" r="0" b="0"/>
+            <wp:docPr id="16" name="Picture 16"/>
+            <wp:cNvGraphicFramePr>
+              <a:graphicFrameLocks xmlns:a="http://schemas.openxmlformats.org/drawingml/2006/main" noChangeAspect="1"/>
+            </wp:cNvGraphicFramePr>
+            <a:graphic xmlns:a="http://schemas.openxmlformats.org/drawingml/2006/main">
+              <a:graphicData uri="http://schemas.openxmlformats.org/drawingml/2006/picture">
+                <pic:pic xmlns:pic="http://schemas.openxmlformats.org/drawingml/2006/picture">
+                  <pic:nvPicPr>
+                    <pic:cNvPr id="0" name=""/>
+                    <pic:cNvPicPr/>
+                  </pic:nvPicPr>
+                  <pic:blipFill>
+                    <a:blip r:embed="rId23"/>
+                    <a:stretch>
+                      <a:fillRect/>
+                    </a:stretch>
+                  </pic:blipFill>
+                  <pic:spPr>
+                    <a:xfrm>
+                      <a:off x="0" y="0"/>
+                      <a:ext cx="5943600" cy="3341370"/>
+                    </a:xfrm>
+                    <a:prstGeom prst="rect">
+                      <a:avLst/>
+                    </a:prstGeom>
+                  </pic:spPr>
+                </pic:pic>
+              </a:graphicData>
+            </a:graphic>
+          </wp:inline>
+        </w:drawing>
+      </w:r>
+    </w:p>
+    <w:p>
+      <w:r>
+        <w:rPr>
+          <w:noProof/>
+          <w:lang w:bidi="hi-IN"/>
+        </w:rPr>
+        <w:drawing>
+          <wp:inline distT="0" distB="0" distL="0" distR="0" wp14:anchorId="4F95A106" wp14:editId="0AF090FF">
+            <wp:extent cx="5943600" cy="3341370"/>
+            <wp:effectExtent l="0" t="0" r="0" b="0"/>
+            <wp:docPr id="18" name="Picture 18"/>
+            <wp:cNvGraphicFramePr>
+              <a:graphicFrameLocks xmlns:a="http://schemas.openxmlformats.org/drawingml/2006/main" noChangeAspect="1"/>
+            </wp:cNvGraphicFramePr>
+            <a:graphic xmlns:a="http://schemas.openxmlformats.org/drawingml/2006/main">
+              <a:graphicData uri="http://schemas.openxmlformats.org/drawingml/2006/picture">
+                <pic:pic xmlns:pic="http://schemas.openxmlformats.org/drawingml/2006/picture">
+                  <pic:nvPicPr>
+                    <pic:cNvPr id="0" name=""/>
+                    <pic:cNvPicPr/>
+                  </pic:nvPicPr>
+                  <pic:blipFill>
+                    <a:blip r:embed="rId24"/>
+                    <a:stretch>
+                      <a:fillRect/>
+                    </a:stretch>
+                  </pic:blipFill>
+                  <pic:spPr>
+                    <a:xfrm>
+                      <a:off x="0" y="0"/>
+                      <a:ext cx="5943600" cy="3341370"/>
+                    </a:xfrm>
+                    <a:prstGeom prst="rect">
+                      <a:avLst/>
+                    </a:prstGeom>
+                  </pic:spPr>
+                </pic:pic>
+              </a:graphicData>
+            </a:graphic>
+          </wp:inline>
+        </w:drawing>
+      </w:r>
+    </w:p>
+    <w:p>
+      <w:r>
+        <w:rPr>
+          <w:noProof/>
+          <w:lang w:bidi="hi-IN"/>
+        </w:rPr>
+        <w:lastRenderedPageBreak/>
+        <w:drawing>
+          <wp:inline distT="0" distB="0" distL="0" distR="0" wp14:anchorId="126BA4EA" wp14:editId="611D3132">
+            <wp:extent cx="5943600" cy="3341370"/>
+            <wp:effectExtent l="0" t="0" r="0" b="0"/>
+            <wp:docPr id="19" name="Picture 19"/>
+            <wp:cNvGraphicFramePr>
+              <a:graphicFrameLocks xmlns:a="http://schemas.openxmlformats.org/drawingml/2006/main" noChangeAspect="1"/>
+            </wp:cNvGraphicFramePr>
+            <a:graphic xmlns:a="http://schemas.openxmlformats.org/drawingml/2006/main">
+              <a:graphicData uri="http://schemas.openxmlformats.org/drawingml/2006/picture">
+                <pic:pic xmlns:pic="http://schemas.openxmlformats.org/drawingml/2006/picture">
+                  <pic:nvPicPr>
+                    <pic:cNvPr id="0" name=""/>
+                    <pic:cNvPicPr/>
+                  </pic:nvPicPr>
+                  <pic:blipFill>
+                    <a:blip r:embed="rId25"/>
+                    <a:stretch>
+                      <a:fillRect/>
+                    </a:stretch>
+                  </pic:blipFill>
+                  <pic:spPr>
+                    <a:xfrm>
+                      <a:off x="0" y="0"/>
+                      <a:ext cx="5943600" cy="3341370"/>
+                    </a:xfrm>
+                    <a:prstGeom prst="rect">
+                      <a:avLst/>
+                    </a:prstGeom>
+                  </pic:spPr>
+                </pic:pic>
+              </a:graphicData>
+            </a:graphic>
+          </wp:inline>
+        </w:drawing>
+      </w:r>
+    </w:p>
+    <w:p>
+      <w:r>
+        <w:rPr>
+          <w:noProof/>
+          <w:lang w:bidi="hi-IN"/>
+        </w:rPr>
+        <w:drawing>
+          <wp:inline distT="0" distB="0" distL="0" distR="0" wp14:anchorId="2786EEDF" wp14:editId="0E1D7883">
+            <wp:extent cx="5943600" cy="3341370"/>
+            <wp:effectExtent l="0" t="0" r="0" b="0"/>
+            <wp:docPr id="20" name="Picture 20"/>
+            <wp:cNvGraphicFramePr>
+              <a:graphicFrameLocks xmlns:a="http://schemas.openxmlformats.org/drawingml/2006/main" noChangeAspect="1"/>
+            </wp:cNvGraphicFramePr>
+            <a:graphic xmlns:a="http://schemas.openxmlformats.org/drawingml/2006/main">
+              <a:graphicData uri="http://schemas.openxmlformats.org/drawingml/2006/picture">
+                <pic:pic xmlns:pic="http://schemas.openxmlformats.org/drawingml/2006/picture">
+                  <pic:nvPicPr>
+                    <pic:cNvPr id="0" name=""/>
+                    <pic:cNvPicPr/>
+                  </pic:nvPicPr>
+                  <pic:blipFill>
+                    <a:blip r:embed="rId26"/>
+                    <a:stretch>
+                      <a:fillRect/>
+                    </a:stretch>
+                  </pic:blipFill>
+                  <pic:spPr>
+                    <a:xfrm>
+                      <a:off x="0" y="0"/>
+                      <a:ext cx="5943600" cy="3341370"/>
+                    </a:xfrm>
+                    <a:prstGeom prst="rect">
+                      <a:avLst/>
+                    </a:prstGeom>
+                  </pic:spPr>
+                </pic:pic>
+              </a:graphicData>
+            </a:graphic>
+          </wp:inline>
+        </w:drawing>
+      </w:r>
+    </w:p>
+    <w:p>
+      <w:r>
+        <w:rPr>
+          <w:noProof/>
+          <w:lang w:bidi="hi-IN"/>
+        </w:rPr>
+        <w:lastRenderedPageBreak/>
+        <w:drawing>
+          <wp:inline distT="0" distB="0" distL="0" distR="0" wp14:anchorId="3ADAE0F4" wp14:editId="3BEF460D">
+            <wp:extent cx="5943600" cy="3341370"/>
+            <wp:effectExtent l="0" t="0" r="0" b="0"/>
+            <wp:docPr id="21" name="Picture 21"/>
+            <wp:cNvGraphicFramePr>
+              <a:graphicFrameLocks xmlns:a="http://schemas.openxmlformats.org/drawingml/2006/main" noChangeAspect="1"/>
+            </wp:cNvGraphicFramePr>
+            <a:graphic xmlns:a="http://schemas.openxmlformats.org/drawingml/2006/main">
+              <a:graphicData uri="http://schemas.openxmlformats.org/drawingml/2006/picture">
+                <pic:pic xmlns:pic="http://schemas.openxmlformats.org/drawingml/2006/picture">
+                  <pic:nvPicPr>
+                    <pic:cNvPr id="0" name=""/>
+                    <pic:cNvPicPr/>
+                  </pic:nvPicPr>
+                  <pic:blipFill>
+                    <a:blip r:embed="rId27"/>
+                    <a:stretch>
+                      <a:fillRect/>
+                    </a:stretch>
+                  </pic:blipFill>
+                  <pic:spPr>
+                    <a:xfrm>
+                      <a:off x="0" y="0"/>
+                      <a:ext cx="5943600" cy="3341370"/>
+                    </a:xfrm>
+                    <a:prstGeom prst="rect">
+                      <a:avLst/>
+                    </a:prstGeom>
+                  </pic:spPr>
+                </pic:pic>
+              </a:graphicData>
+            </a:graphic>
+          </wp:inline>
+        </w:drawing>
+      </w:r>
       <w:bookmarkStart w:id="0" w:name="_GoBack"/>
       <w:bookmarkEnd w:id="0"/>
+    </w:p>
+    <w:p>
+      <w:r>
+        <w:rPr>
+          <w:noProof/>
+          <w:lang w:bidi="hi-IN"/>
+        </w:rPr>
+        <w:drawing>
+          <wp:inline distT="0" distB="0" distL="0" distR="0" wp14:anchorId="5CA03B1A" wp14:editId="79E6D587">
+            <wp:extent cx="5943600" cy="3341370"/>
+            <wp:effectExtent l="0" t="0" r="0" b="0"/>
+            <wp:docPr id="22" name="Picture 22"/>
+            <wp:cNvGraphicFramePr>
+              <a:graphicFrameLocks xmlns:a="http://schemas.openxmlformats.org/drawingml/2006/main" noChangeAspect="1"/>
+            </wp:cNvGraphicFramePr>
+            <a:graphic xmlns:a="http://schemas.openxmlformats.org/drawingml/2006/main">
+              <a:graphicData uri="http://schemas.openxmlformats.org/drawingml/2006/picture">
+                <pic:pic xmlns:pic="http://schemas.openxmlformats.org/drawingml/2006/picture">
+                  <pic:nvPicPr>
+                    <pic:cNvPr id="0" name=""/>
+                    <pic:cNvPicPr/>
+                  </pic:nvPicPr>
+                  <pic:blipFill>
+                    <a:blip r:embed="rId28"/>
+                    <a:stretch>
+                      <a:fillRect/>
+                    </a:stretch>
+                  </pic:blipFill>
+                  <pic:spPr>
+                    <a:xfrm>
+                      <a:off x="0" y="0"/>
+                      <a:ext cx="5943600" cy="3341370"/>
+                    </a:xfrm>
+                    <a:prstGeom prst="rect">
+                      <a:avLst/>
+                    </a:prstGeom>
+                  </pic:spPr>
+                </pic:pic>
+              </a:graphicData>
+            </a:graphic>
+          </wp:inline>
+        </w:drawing>
+      </w:r>
     </w:p>
     <w:sectPr>
       <w:pgSz w:w="12240" w:h="15840"/>

</xml_diff>

<commit_message>
Week 5: Finalized Dynamic UI and DOM Logic
</commit_message>
<xml_diff>
--- a/REAL Time Chat App Screenshots.docx
+++ b/REAL Time Chat App Screenshots.docx
@@ -978,51 +978,148 @@
           </wp:inline>
         </w:drawing>
       </w:r>
+    </w:p>
+    <w:p>
+      <w:r>
+        <w:rPr>
+          <w:noProof/>
+          <w:lang w:bidi="hi-IN"/>
+        </w:rPr>
+        <w:drawing>
+          <wp:inline distT="0" distB="0" distL="0" distR="0" wp14:anchorId="5CA03B1A" wp14:editId="79E6D587">
+            <wp:extent cx="5943600" cy="3341370"/>
+            <wp:effectExtent l="0" t="0" r="0" b="0"/>
+            <wp:docPr id="22" name="Picture 22"/>
+            <wp:cNvGraphicFramePr>
+              <a:graphicFrameLocks xmlns:a="http://schemas.openxmlformats.org/drawingml/2006/main" noChangeAspect="1"/>
+            </wp:cNvGraphicFramePr>
+            <a:graphic xmlns:a="http://schemas.openxmlformats.org/drawingml/2006/main">
+              <a:graphicData uri="http://schemas.openxmlformats.org/drawingml/2006/picture">
+                <pic:pic xmlns:pic="http://schemas.openxmlformats.org/drawingml/2006/picture">
+                  <pic:nvPicPr>
+                    <pic:cNvPr id="0" name=""/>
+                    <pic:cNvPicPr/>
+                  </pic:nvPicPr>
+                  <pic:blipFill>
+                    <a:blip r:embed="rId28"/>
+                    <a:stretch>
+                      <a:fillRect/>
+                    </a:stretch>
+                  </pic:blipFill>
+                  <pic:spPr>
+                    <a:xfrm>
+                      <a:off x="0" y="0"/>
+                      <a:ext cx="5943600" cy="3341370"/>
+                    </a:xfrm>
+                    <a:prstGeom prst="rect">
+                      <a:avLst/>
+                    </a:prstGeom>
+                  </pic:spPr>
+                </pic:pic>
+              </a:graphicData>
+            </a:graphic>
+          </wp:inline>
+        </w:drawing>
+      </w:r>
+    </w:p>
+    <w:p/>
+    <w:p/>
+    <w:p/>
+    <w:p/>
+    <w:p>
+      <w:r>
+        <w:lastRenderedPageBreak/>
+        <w:t>WEEK 5</w:t>
+      </w:r>
+    </w:p>
+    <w:p>
+      <w:r>
+        <w:rPr>
+          <w:noProof/>
+          <w:lang w:bidi="hi-IN"/>
+        </w:rPr>
+        <w:drawing>
+          <wp:inline distT="0" distB="0" distL="0" distR="0" wp14:anchorId="6E1670C7" wp14:editId="60B5C718">
+            <wp:extent cx="5943600" cy="3341370"/>
+            <wp:effectExtent l="0" t="0" r="0" b="0"/>
+            <wp:docPr id="23" name="Picture 23"/>
+            <wp:cNvGraphicFramePr>
+              <a:graphicFrameLocks xmlns:a="http://schemas.openxmlformats.org/drawingml/2006/main" noChangeAspect="1"/>
+            </wp:cNvGraphicFramePr>
+            <a:graphic xmlns:a="http://schemas.openxmlformats.org/drawingml/2006/main">
+              <a:graphicData uri="http://schemas.openxmlformats.org/drawingml/2006/picture">
+                <pic:pic xmlns:pic="http://schemas.openxmlformats.org/drawingml/2006/picture">
+                  <pic:nvPicPr>
+                    <pic:cNvPr id="0" name=""/>
+                    <pic:cNvPicPr/>
+                  </pic:nvPicPr>
+                  <pic:blipFill>
+                    <a:blip r:embed="rId29"/>
+                    <a:stretch>
+                      <a:fillRect/>
+                    </a:stretch>
+                  </pic:blipFill>
+                  <pic:spPr>
+                    <a:xfrm>
+                      <a:off x="0" y="0"/>
+                      <a:ext cx="5943600" cy="3341370"/>
+                    </a:xfrm>
+                    <a:prstGeom prst="rect">
+                      <a:avLst/>
+                    </a:prstGeom>
+                  </pic:spPr>
+                </pic:pic>
+              </a:graphicData>
+            </a:graphic>
+          </wp:inline>
+        </w:drawing>
+      </w:r>
+    </w:p>
+    <w:p/>
+    <w:p>
+      <w:r>
+        <w:rPr>
+          <w:noProof/>
+          <w:lang w:bidi="hi-IN"/>
+        </w:rPr>
+        <w:drawing>
+          <wp:inline distT="0" distB="0" distL="0" distR="0" wp14:anchorId="7ED6B133" wp14:editId="2578648D">
+            <wp:extent cx="5943600" cy="3341370"/>
+            <wp:effectExtent l="0" t="0" r="0" b="0"/>
+            <wp:docPr id="24" name="Picture 24"/>
+            <wp:cNvGraphicFramePr>
+              <a:graphicFrameLocks xmlns:a="http://schemas.openxmlformats.org/drawingml/2006/main" noChangeAspect="1"/>
+            </wp:cNvGraphicFramePr>
+            <a:graphic xmlns:a="http://schemas.openxmlformats.org/drawingml/2006/main">
+              <a:graphicData uri="http://schemas.openxmlformats.org/drawingml/2006/picture">
+                <pic:pic xmlns:pic="http://schemas.openxmlformats.org/drawingml/2006/picture">
+                  <pic:nvPicPr>
+                    <pic:cNvPr id="0" name=""/>
+                    <pic:cNvPicPr/>
+                  </pic:nvPicPr>
+                  <pic:blipFill>
+                    <a:blip r:embed="rId30"/>
+                    <a:stretch>
+                      <a:fillRect/>
+                    </a:stretch>
+                  </pic:blipFill>
+                  <pic:spPr>
+                    <a:xfrm>
+                      <a:off x="0" y="0"/>
+                      <a:ext cx="5943600" cy="3341370"/>
+                    </a:xfrm>
+                    <a:prstGeom prst="rect">
+                      <a:avLst/>
+                    </a:prstGeom>
+                  </pic:spPr>
+                </pic:pic>
+              </a:graphicData>
+            </a:graphic>
+          </wp:inline>
+        </w:drawing>
+      </w:r>
       <w:bookmarkStart w:id="0" w:name="_GoBack"/>
       <w:bookmarkEnd w:id="0"/>
-    </w:p>
-    <w:p>
-      <w:r>
-        <w:rPr>
-          <w:noProof/>
-          <w:lang w:bidi="hi-IN"/>
-        </w:rPr>
-        <w:drawing>
-          <wp:inline distT="0" distB="0" distL="0" distR="0" wp14:anchorId="5CA03B1A" wp14:editId="79E6D587">
-            <wp:extent cx="5943600" cy="3341370"/>
-            <wp:effectExtent l="0" t="0" r="0" b="0"/>
-            <wp:docPr id="22" name="Picture 22"/>
-            <wp:cNvGraphicFramePr>
-              <a:graphicFrameLocks xmlns:a="http://schemas.openxmlformats.org/drawingml/2006/main" noChangeAspect="1"/>
-            </wp:cNvGraphicFramePr>
-            <a:graphic xmlns:a="http://schemas.openxmlformats.org/drawingml/2006/main">
-              <a:graphicData uri="http://schemas.openxmlformats.org/drawingml/2006/picture">
-                <pic:pic xmlns:pic="http://schemas.openxmlformats.org/drawingml/2006/picture">
-                  <pic:nvPicPr>
-                    <pic:cNvPr id="0" name=""/>
-                    <pic:cNvPicPr/>
-                  </pic:nvPicPr>
-                  <pic:blipFill>
-                    <a:blip r:embed="rId28"/>
-                    <a:stretch>
-                      <a:fillRect/>
-                    </a:stretch>
-                  </pic:blipFill>
-                  <pic:spPr>
-                    <a:xfrm>
-                      <a:off x="0" y="0"/>
-                      <a:ext cx="5943600" cy="3341370"/>
-                    </a:xfrm>
-                    <a:prstGeom prst="rect">
-                      <a:avLst/>
-                    </a:prstGeom>
-                  </pic:spPr>
-                </pic:pic>
-              </a:graphicData>
-            </a:graphic>
-          </wp:inline>
-        </w:drawing>
-      </w:r>
     </w:p>
     <w:sectPr>
       <w:pgSz w:w="12240" w:h="15840"/>

</xml_diff>